<commit_message>
Se actualizó documentación y scripts que generan esta documentación.
</commit_message>
<xml_diff>
--- a/ploteo/pruebas_uni/CURSO_MEDIA/CURSO_TESTS_UNITARIOS.docx
+++ b/ploteo/pruebas_uni/CURSO_MEDIA/CURSO_TESTS_UNITARIOS.docx
@@ -64,7 +64,7 @@
         <w:pStyle w:val="ListBullet"/>
       </w:pPr>
       <w:r>
-        <w:t>Regla de oro del proyecto: todo archivo test_*.py que dejes en pruebas/ corre automáticamente en la marcha blanca del instalador. Valida siempre en local antes (python3 -m pytest pruebas -v) para no bloquear instalaciones ajenas.</w:t>
+        <w:t>Regla de oro del proyecto: todo archivo test_*.py que dejes en pruebas_uni/ (desarrollo) corre automáticamente en la marcha blanca del instalador (en el paquete instalado vive en fuentes/pruebas/). Valida siempre en local antes (cd ploteo &amp;&amp; NEWPT_DATA_DIR=$PWD python3 -m pytest pruebas_uni -v) para no bloquear instalaciones ajenas.</w:t>
       </w:r>
     </w:p>
     <w:p>
@@ -487,7 +487,7 @@
           </w:tcPr>
           <w:p>
             <w:r>
-              <w:t>pruebas/ (junto a los tests existentes)</w:t>
+              <w:t>pruebas_uni/ (junto a los tests existentes)</w:t>
             </w:r>
           </w:p>
         </w:tc>
@@ -915,7 +915,7 @@
     </w:p>
     <w:p>
       <w:r>
-        <w:t>Muchos tests necesitan un escenario: archivos temporales, variables de entorno, datos de ejemplo. En unittest eso vive en setUp/tearDown (mira la clase BaseConsulta de pruebas/test_consulta.py). En pytest se usa un @pytest.fixture: una función que prepara el escenario y que cada test recibe como parámetro.</w:t>
+        <w:t>Muchos tests necesitan un escenario: archivos temporales, variables de entorno, datos de ejemplo. En unittest eso vive en setUp/tearDown (mira la clase BaseConsulta de pruebas_uni/IA_pruebas/test_consulta.py). En pytest se usa un @pytest.fixture: una función que prepara el escenario y que cada test recibe como parámetro.</w:t>
       </w:r>
     </w:p>
     <w:p>
@@ -1137,7 +1137,7 @@
           <w:rFonts w:ascii="Consolas" w:hAnsi="Consolas"/>
           <w:sz w:val="19"/>
         </w:rPr>
-        <w:t>python3 -m pytest pruebas -v          # toda la carpeta</w:t>
+        <w:t>export NEWPT_DATA_DIR=$PWD   # los tests C de datos (test_datos.py) leen de aquí</w:t>
       </w:r>
     </w:p>
     <w:p>
@@ -1149,7 +1149,7 @@
           <w:rFonts w:ascii="Consolas" w:hAnsi="Consolas"/>
           <w:sz w:val="19"/>
         </w:rPr>
-        <w:t>python3 -m pytest pruebas/test_lab1_avance.py -v   # un archivo</w:t>
+        <w:t>python3 -m pytest pruebas_uni -v          # toda la carpeta</w:t>
       </w:r>
     </w:p>
     <w:p>
@@ -1161,7 +1161,7 @@
           <w:rFonts w:ascii="Consolas" w:hAnsi="Consolas"/>
           <w:sz w:val="19"/>
         </w:rPr>
-        <w:t>python3 -m pytest pruebas -k profundidad -v # por nombre</w:t>
+        <w:t>python3 -m pytest pruebas_uni/IA_pruebas/test_lab1_avance.py -v   # un archivo</w:t>
       </w:r>
     </w:p>
     <w:p>
@@ -1173,7 +1173,7 @@
           <w:rFonts w:ascii="Consolas" w:hAnsi="Consolas"/>
           <w:sz w:val="19"/>
         </w:rPr>
-        <w:t>python3 -m pytest pruebas -x               # detener en el 1er fallo</w:t>
+        <w:t>python3 -m pytest pruebas_uni -k profundidad -v # por nombre</w:t>
       </w:r>
     </w:p>
     <w:p>
@@ -1185,7 +1185,19 @@
           <w:rFonts w:ascii="Consolas" w:hAnsi="Consolas"/>
           <w:sz w:val="19"/>
         </w:rPr>
-        <w:t>python3 -m pytest pruebas --tb=short       # tracebacks cortos</w:t>
+        <w:t>python3 -m pytest pruebas_uni -x               # detener en el 1er fallo</w:t>
+      </w:r>
+    </w:p>
+    <w:p>
+      <w:pPr>
+        <w:spacing w:after="0"/>
+      </w:pPr>
+      <w:r>
+        <w:rPr>
+          <w:rFonts w:ascii="Consolas" w:hAnsi="Consolas"/>
+          <w:sz w:val="19"/>
+        </w:rPr>
+        <w:t>python3 -m pytest pruebas_uni --tb=short       # tracebacks cortos</w:t>
       </w:r>
     </w:p>
     <w:p>
@@ -1618,7 +1630,7 @@
           <w:rFonts w:ascii="Consolas" w:hAnsi="Consolas"/>
           <w:sz w:val="19"/>
         </w:rPr>
-        <w:t>2. python3 -m pytest pruebas/test_tuyo.py -v   → PASSED</w:t>
+        <w:t>2. python3 -m pytest pruebas_uni/IA_pruebas/test_tuyo.py -v   → PASSED</w:t>
       </w:r>
     </w:p>
     <w:p>
@@ -1630,7 +1642,7 @@
           <w:rFonts w:ascii="Consolas" w:hAnsi="Consolas"/>
           <w:sz w:val="19"/>
         </w:rPr>
-        <w:t>3. black pruebas/test_tuyo.py                  → formato uniforme</w:t>
+        <w:t>3. black pruebas_uni/IA_pruebas/test_tuyo.py          → formato uniforme</w:t>
       </w:r>
     </w:p>
     <w:p>
@@ -1654,7 +1666,7 @@
           <w:rFonts w:ascii="Consolas" w:hAnsi="Consolas"/>
           <w:sz w:val="19"/>
         </w:rPr>
-        <w:t>5. python3 -m pytest pruebas -v                → todo verde = listo</w:t>
+        <w:t>5. python3 -m pytest pruebas_uni -v                → todo verde = listo</w:t>
       </w:r>
     </w:p>
     <w:p>
@@ -1747,7 +1759,7 @@
     </w:p>
     <w:p>
       <w:r>
-        <w:t>Seis ejercicios progresivos que cubren TODO módulo aún sin tests. Crea cada archivo dentro de pruebas/ con el nombre indicado. Al terminar cada uno: pytest en verde → black → docstrings (ya incluidos en las soluciones del capítulo 9).</w:t>
+        <w:t>Seis ejercicios progresivos que cubren TODO módulo aún sin tests. Crea cada archivo dentro de pruebas_uni/IA_pruebas/ con el nombre indicado. Al terminar cada uno: pytest en verde → black → docstrings (ya incluidos en las soluciones del capítulo 9).</w:t>
       </w:r>
     </w:p>
     <w:tbl>
@@ -2102,7 +2114,7 @@
         <w:pStyle w:val="IntenseQuote"/>
       </w:pPr>
       <w:r>
-        <w:t>pruebas/test_lab1_avance.py</w:t>
+        <w:t>pruebas_uni/IA_pruebas/test_lab1_avance.py</w:t>
       </w:r>
     </w:p>
     <w:p>
@@ -2194,7 +2206,7 @@
         <w:pStyle w:val="IntenseQuote"/>
       </w:pPr>
       <w:r>
-        <w:t>pruebas/test_lab2_contar_lineas.py</w:t>
+        <w:t>pruebas_uni/IA_pruebas/test_lab2_contar_lineas.py</w:t>
       </w:r>
     </w:p>
     <w:p>
@@ -2286,7 +2298,7 @@
         <w:pStyle w:val="IntenseQuote"/>
       </w:pPr>
       <w:r>
-        <w:t>pruebas/test_lab3_inicializar_csv.py</w:t>
+        <w:t>pruebas_uni/IA_pruebas/test_lab3_inicializar_csv.py</w:t>
       </w:r>
     </w:p>
     <w:p>
@@ -2339,7 +2351,7 @@
         <w:pStyle w:val="IntenseQuote"/>
       </w:pPr>
       <w:r>
-        <w:t>pruebas/test_lab4_lee_catalogo.py</w:t>
+        <w:t>pruebas_uni/IA_pruebas/test_lab4_lee_catalogo.py</w:t>
       </w:r>
     </w:p>
     <w:p>
@@ -2392,7 +2404,7 @@
         <w:pStyle w:val="IntenseQuote"/>
       </w:pPr>
       <w:r>
-        <w:t>pruebas/test_lab5_ruta_datos.py</w:t>
+        <w:t>pruebas_uni/IA_pruebas/test_lab5_ruta_datos.py</w:t>
       </w:r>
     </w:p>
     <w:p>
@@ -2437,7 +2449,7 @@
         <w:pStyle w:val="IntenseQuote"/>
       </w:pPr>
       <w:r>
-        <w:t>pruebas/test_lab6_procesar_xyz.py</w:t>
+        <w:t>pruebas_uni/IA_pruebas/test_lab6_procesar_xyz.py</w:t>
       </w:r>
     </w:p>
     <w:p>
@@ -4403,7 +4415,7 @@
           <w:b/>
           <w:sz w:val="20"/>
         </w:rPr>
-        <w:t>NOTA: cuando tus tests estén verdes, quedan integrados solos: pytest los descubre en pruebas/ y la marcha blanca del instalador los correrá de ahí en adelante.</w:t>
+        <w:t>NOTA: cuando tus tests estén verdes, quedan integrados solos: pytest los descubre en pruebas_uni/ y, al regenerar el instalador (./crear_instalador.sh), la marcha blanca los correrá de ahí en adelante.</w:t>
       </w:r>
     </w:p>
     <w:sectPr>

</xml_diff>